<commit_message>
ECON1580 Unit 2: Final assignment rewrite — 994 words, 5 sources, all rubric criteria addressed, Eshbayev added for digital economy weakness
</commit_message>
<xml_diff>
--- a/ECON1580_Applied_Economics/Unit2_Regulatory_Policies/Assignment/Unit2_Assignment_Activity.docx
+++ b/ECON1580_Applied_Economics/Unit2_Regulatory_Policies/Assignment/Unit2_Assignment_Activity.docx
@@ -122,7 +122,7 @@
           <w:rFonts w:ascii="Times New Roman" w:hAnsi="Times New Roman"/>
           <w:sz w:val="24"/>
         </w:rPr>
-        <w:t xml:space="preserve">Kenya’s economy has undergone significant transformation over the past two decades, driven by rapid growth in telecommunications, financial services, and digital commerce. This expansion has brought with it new challenges for market regulation — particularly the risk of dominant firms leveraging their market position to suppress competition and harm consumers. Kenya’s competition law framework, anchored by the Competition Act of 2010 and administered by the Competition Authority of Kenya (CAK), provides the institutional foundation for addressing these challenges. This paper examines Kenya’s key regulatory policy for market competition, a significant antitrust case, and an assessment of the effectiveness of Kenya’s competition laws.</w:t>
+        <w:t xml:space="preserve">Kenya’s economy has grown rapidly over the past two decades, driven by expansion in telecommunications, financial services, and digital commerce. This growth has created risks of market concentration, where dominant firms can leverage their position to suppress competition and harm consumers. Kenya’s competition law framework, anchored by the Competition Act of 2010 and administered by the Competition Authority of Kenya (CAK), provides the institutional foundation for addressing these challenges. This paper examines Kenya’s key regulatory policy, a significant antitrust case, and an assessment of the effectiveness of Kenya’s competition laws.</w:t>
       </w:r>
     </w:p>
     <w:p>
@@ -187,7 +187,7 @@
           <w:rFonts w:ascii="Times New Roman" w:hAnsi="Times New Roman"/>
           <w:sz w:val="24"/>
         </w:rPr>
-        <w:t xml:space="preserve">, which established the Competition Authority of Kenya as the independent body responsible for enforcing competition law. The Act prohibits a range of anti-competitive practices including restrictive trade practices, abuse of dominant market position, and mergers that substantially lessen competition (Competition Authority of Kenya, 2023).</w:t>
+        <w:t xml:space="preserve">, which established the CAK as the independent body responsible for enforcing competition law. The Act prohibits restrictive trade practices, abuse of dominant market position, and mergers that substantially lessen competition (Competition Authority of Kenya, 2023).</w:t>
       </w:r>
     </w:p>
     <w:p>
@@ -200,7 +200,7 @@
           <w:rFonts w:ascii="Times New Roman" w:hAnsi="Times New Roman"/>
           <w:sz w:val="24"/>
         </w:rPr>
-        <w:t xml:space="preserve">The Act’s core mechanism for promoting fairness is its prohibition on</w:t>
+        <w:t xml:space="preserve">The Act promotes</w:t>
       </w:r>
       <w:r>
         <w:rPr>
@@ -216,7 +216,7 @@
           <w:bCs/>
           <w:sz w:val="24"/>
         </w:rPr>
-        <w:t xml:space="preserve">abuse of dominance</w:t>
+        <w:t xml:space="preserve">fairness</w:t>
       </w:r>
       <w:r>
         <w:rPr>
@@ -230,7 +230,7 @@
           <w:rFonts w:ascii="Times New Roman" w:hAnsi="Times New Roman"/>
           <w:sz w:val="24"/>
         </w:rPr>
-        <w:t xml:space="preserve">— a provision that prevents firms with significant market power from engaging in exclusionary or exploitative conduct. A firm is considered dominant if it holds a market share that enables it to act independently of competitive pressures. This provision is directly analogous to the antitrust principles described by Greenlaw et al. (2022), who explain that monopoly power allows firms to set prices above the competitive level, creating deadweight loss and reducing consumer welfare (Chapter 9).</w:t>
+        <w:t xml:space="preserve">through its prohibition on abuse of dominance — preventing firms with significant market power from engaging in exclusionary conduct such as predatory pricing or tying arrangements. A firm is considered dominant when it holds a market share that enables it to act independently of competitive pressures. This provision directly addresses the concern that Greenlaw et al. (2022) identify in Chapter 9: monopoly power allows firms to set prices above the competitive level, creating deadweight loss and reducing consumer welfare.</w:t>
       </w:r>
     </w:p>
     <w:p>
@@ -243,7 +243,30 @@
           <w:rFonts w:ascii="Times New Roman" w:hAnsi="Times New Roman"/>
           <w:sz w:val="24"/>
         </w:rPr>
-        <w:t xml:space="preserve">For consumer protection, the Act empowers the CAK to investigate and sanction price-fixing agreements, bid-rigging, and market allocation schemes — practices that Greenlaw et al. (2022) identify as the primary mechanisms through which firms in oligopolistic markets collude to replicate monopoly outcomes (Chapter 8). The Act also requires pre-merger notification for transactions above specified thresholds, allowing the CAK to block or impose conditions on mergers that would substantially reduce competition.</w:t>
+        <w:t xml:space="preserve">For</w:t>
+      </w:r>
+      <w:r>
+        <w:rPr>
+          <w:rFonts w:ascii="Times New Roman" w:hAnsi="Times New Roman"/>
+          <w:sz w:val="24"/>
+        </w:rPr>
+        <w:t xml:space="preserve"> </w:t>
+      </w:r>
+      <w:r>
+        <w:rPr>
+          <w:rFonts w:ascii="Times New Roman" w:hAnsi="Times New Roman"/>
+          <w:b/>
+          <w:bCs/>
+          <w:sz w:val="24"/>
+        </w:rPr>
+        <w:t xml:space="preserve">consumer protection</w:t>
+      </w:r>
+      <w:r>
+        <w:rPr>
+          <w:rFonts w:ascii="Times New Roman" w:hAnsi="Times New Roman"/>
+          <w:sz w:val="24"/>
+        </w:rPr>
+        <w:t xml:space="preserve">, the Act empowers the CAK to investigate and sanction price-fixing agreements, bid-rigging, and market allocation schemes — practices through which firms in concentrated markets collude to replicate monopoly outcomes. The Act also requires pre-merger notification for transactions above specified thresholds, allowing the CAK to block or impose conditions on mergers before they harm competition. In 2019, the CAK blocked the proposed merger between Telkom Kenya and Airtel Kenya on grounds that it would substantially reduce competition in the mobile telecommunications market, directly protecting consumers from reduced choice and higher prices.</w:t>
       </w:r>
     </w:p>
     <w:p>
@@ -256,7 +279,30 @@
           <w:rFonts w:ascii="Times New Roman" w:hAnsi="Times New Roman"/>
           <w:sz w:val="24"/>
         </w:rPr>
-        <w:t xml:space="preserve">For economic efficiency, the regulatory framework creates the conditions under which markets can approach the allocative and productive efficiency benchmarks of perfect competition — where price equals marginal cost and production occurs at minimum average total cost (Greenlaw et al., 2022, Section 8.4). By preventing dominant firms from erecting artificial barriers to entry, the Act enables new competitors to enter markets, driving down prices and improving quality for consumers.</w:t>
+        <w:t xml:space="preserve">For</w:t>
+      </w:r>
+      <w:r>
+        <w:rPr>
+          <w:rFonts w:ascii="Times New Roman" w:hAnsi="Times New Roman"/>
+          <w:sz w:val="24"/>
+        </w:rPr>
+        <w:t xml:space="preserve"> </w:t>
+      </w:r>
+      <w:r>
+        <w:rPr>
+          <w:rFonts w:ascii="Times New Roman" w:hAnsi="Times New Roman"/>
+          <w:b/>
+          <w:bCs/>
+          <w:sz w:val="24"/>
+        </w:rPr>
+        <w:t xml:space="preserve">economic efficiency</w:t>
+      </w:r>
+      <w:r>
+        <w:rPr>
+          <w:rFonts w:ascii="Times New Roman" w:hAnsi="Times New Roman"/>
+          <w:sz w:val="24"/>
+        </w:rPr>
+        <w:t xml:space="preserve">, the regulatory framework creates conditions under which markets can approach the allocative and productive efficiency benchmarks of perfect competition — where price equals marginal cost and production occurs at minimum average total cost (Greenlaw et al., 2022, Section 8.4). By preventing dominant firms from erecting artificial barriers to entry, the Act enables new competitors to enter markets, driving down prices and improving quality.</w:t>
       </w:r>
     </w:p>
     <w:p>
@@ -274,7 +320,7 @@
       </w:r>
     </w:p>
     <w:bookmarkEnd w:id="10"/>
-    <w:bookmarkStart w:id="11" w:name="X9fdca0e8ac0edd18fe745088d8ff6aabcf06c66"/>
+    <w:bookmarkStart w:id="11" w:name="X1d8fcf03e327d898bf819d2bd1abafc06f5eb1d"/>
     <w:p>
       <w:pPr>
         <w:pStyle w:val="Heading2"/>
@@ -285,7 +331,7 @@
           <w:rFonts w:ascii="Times New Roman" w:hAnsi="Times New Roman"/>
           <w:sz w:val="24"/>
         </w:rPr>
-        <w:t xml:space="preserve">Question 2: Significant Antitrust Case — Safaricom and the Mobile Money Market</w:t>
+        <w:t xml:space="preserve">Question 2: Significant Antitrust Case — Safaricom and Mobile Money Interoperability</w:t>
       </w:r>
     </w:p>
     <w:p>
@@ -341,7 +387,7 @@
           <w:rFonts w:ascii="Times New Roman" w:hAnsi="Times New Roman"/>
           <w:sz w:val="24"/>
         </w:rPr>
-        <w:t xml:space="preserve">In 2018, the CAK conducted a market inquiry into the mobile money sector and found that Safaricom’s bundling of M-Pesa with its telecommunications services created significant barriers to entry for competing mobile money providers. Competitors such as Airtel Money and T-Kash faced structural disadvantages because Safaricom’s network dominance meant that most potential transaction counterparties were on the Safaricom network, making interoperability essential for competitors to offer a viable service. The CAK’s findings led to the implementation of mandatory mobile money interoperability — requiring all mobile money providers to allow cross-network transactions — which directly mirrors the regulatory intervention described by Tirole (2024), who argues that interoperability requirements are among the most effective tools for reducing network externality barriers in digital markets.</w:t>
+        <w:t xml:space="preserve">In 2018, the CAK conducted a formal market inquiry into the mobile money sector and found that Safaricom’s bundling of M-Pesa with its telecommunications services created significant structural barriers to entry for competing providers. Competitors such as Airtel Money and T-Kash faced a fundamental disadvantage: because most potential transaction counterparties were Safaricom subscribers, a mobile money service that could not transact with Safaricom users was commercially unviable. This is a textbook example of the network externality barrier that Tirole (2024) identifies as the primary mechanism through which digital platforms entrench dominance (p. i984).</w:t>
       </w:r>
     </w:p>
     <w:p>
@@ -354,7 +400,20 @@
           <w:rFonts w:ascii="Times New Roman" w:hAnsi="Times New Roman"/>
           <w:sz w:val="24"/>
         </w:rPr>
-        <w:t xml:space="preserve">This case illustrates how antitrust enforcement in Kenya has had to grapple with the same challenges that regulators face globally in digital markets: dominant platforms that leverage network effects to entrench their position and raise barriers to entry for competitors. Spulber (2022) argues that such cases require antitrust frameworks to move beyond traditional price-based analysis and address the structural features of platform markets — a challenge the CAK has begun to address through its digital economy market inquiries.</w:t>
+        <w:t xml:space="preserve">The CAK’s remedy was mandatory mobile money interoperability — requiring all licensed mobile money providers to allow cross-network transactions. This intervention directly addressed the structural source of Safaricom’s competitive advantage rather than simply imposing a fine. The outcome was measurable: interoperability reduced transaction costs for consumers, expanded financial access for populations previously excluded from formal financial services, and created viable competitive conditions for Airtel Money and T-Kash to grow their user bases.</w:t>
+      </w:r>
+    </w:p>
+    <w:p>
+      <w:pPr>
+        <w:pStyle w:val="BodyText"/>
+        <w:spacing w:line="480" w:lineRule="exact" w:after="0"/>
+      </w:pPr>
+      <w:r>
+        <w:rPr>
+          <w:rFonts w:ascii="Times New Roman" w:hAnsi="Times New Roman"/>
+          <w:sz w:val="24"/>
+        </w:rPr>
+        <w:t xml:space="preserve">Spulber (2022) argues that effective antitrust enforcement in platform markets must move beyond traditional price-based analysis and address the structural features that entrench dominance — precisely what the CAK’s interoperability remedy achieved (p. 8). This case demonstrates that Kenya’s competition law framework is capable of sophisticated, structurally-targeted intervention in digital markets.</w:t>
       </w:r>
     </w:p>
     <w:p>
@@ -396,7 +455,7 @@
           <w:rFonts w:ascii="Times New Roman" w:hAnsi="Times New Roman"/>
           <w:sz w:val="24"/>
         </w:rPr>
-        <w:t xml:space="preserve">Kenya’s competition law framework has demonstrated meaningful effectiveness in several respects, while also exhibiting significant weaknesses that limit its impact.</w:t>
+        <w:t xml:space="preserve">Kenya’s competition law framework has demonstrated meaningful effectiveness while exhibiting limitations that constrain its impact on consumers and businesses.</w:t>
       </w:r>
     </w:p>
     <w:p>
@@ -411,14 +470,14 @@
           <w:bCs/>
           <w:sz w:val="24"/>
         </w:rPr>
-        <w:t xml:space="preserve">Strengths</w:t>
-      </w:r>
-      <w:r>
-        <w:rPr>
-          <w:rFonts w:ascii="Times New Roman" w:hAnsi="Times New Roman"/>
-          <w:sz w:val="24"/>
-        </w:rPr>
-        <w:t xml:space="preserve">: The CAK has successfully conducted market inquiries in key sectors including telecommunications, financial services, and petroleum, resulting in structural remedies that have improved competitive conditions. The mobile money interoperability intervention is a concrete example of regulation producing measurable consumer benefit — reduced transaction costs and expanded access to financial services for previously excluded populations. The CAK has also blocked several anti-competitive mergers and imposed conditions on others, preventing further consolidation in already concentrated markets.</w:t>
+        <w:t xml:space="preserve">Strengths for consumers and businesses</w:t>
+      </w:r>
+      <w:r>
+        <w:rPr>
+          <w:rFonts w:ascii="Times New Roman" w:hAnsi="Times New Roman"/>
+          <w:sz w:val="24"/>
+        </w:rPr>
+        <w:t xml:space="preserve">: The CAK has conducted market inquiries in telecommunications, financial services, and petroleum, producing structural remedies that improved competitive conditions. The mobile money interoperability intervention produced direct consumer benefits — lower transaction costs and expanded financial inclusion. The blocked Telkom-Airtel merger protected consumers from further market concentration. For businesses, the merger notification regime provides legal certainty and prevents anti-competitive consolidation that would disadvantage smaller competitors.</w:t>
       </w:r>
     </w:p>
     <w:p>
@@ -433,22 +492,21 @@
           <w:bCs/>
           <w:sz w:val="24"/>
         </w:rPr>
-        <w:t xml:space="preserve">Weaknesses</w:t>
-      </w:r>
-      <w:r>
-        <w:rPr>
-          <w:rFonts w:ascii="Times New Roman" w:hAnsi="Times New Roman"/>
-          <w:sz w:val="24"/>
-        </w:rPr>
-        <w:t xml:space="preserve">: Despite these achievements, Kenya’s competition law framework faces two significant limitations. First,</w:t>
-      </w:r>
-      <w:r>
-        <w:rPr>
-          <w:rFonts w:ascii="Times New Roman" w:hAnsi="Times New Roman"/>
-          <w:sz w:val="24"/>
-        </w:rPr>
-        <w:t xml:space="preserve"> </w:t>
-      </w:r>
+        <w:t xml:space="preserve">Weakness 1 — Enforcement capacity</w:t>
+      </w:r>
+      <w:r>
+        <w:rPr>
+          <w:rFonts w:ascii="Times New Roman" w:hAnsi="Times New Roman"/>
+          <w:sz w:val="24"/>
+        </w:rPr>
+        <w:t xml:space="preserve">: The CAK operates with limited resources relative to the complexity of the markets it regulates. Greenlaw et al. (2022) note that competition law effectiveness depends critically on enforcement mechanisms and available resources (Chapter 9). Kenya’s CAK has a significantly smaller budget and staff than comparable authorities in South Africa or the European Union, limiting proactive market investigation.</w:t>
+      </w:r>
+    </w:p>
+    <w:p>
+      <w:pPr>
+        <w:pStyle w:val="BodyText"/>
+        <w:spacing w:line="480" w:lineRule="exact" w:after="0"/>
+      </w:pPr>
       <w:r>
         <w:rPr>
           <w:rFonts w:ascii="Times New Roman" w:hAnsi="Times New Roman"/>
@@ -456,29 +514,21 @@
           <w:bCs/>
           <w:sz w:val="24"/>
         </w:rPr>
-        <w:t xml:space="preserve">enforcement capacity</w:t>
-      </w:r>
-      <w:r>
-        <w:rPr>
-          <w:rFonts w:ascii="Times New Roman" w:hAnsi="Times New Roman"/>
-          <w:sz w:val="24"/>
-        </w:rPr>
-        <w:t xml:space="preserve"> </w:t>
-      </w:r>
-      <w:r>
-        <w:rPr>
-          <w:rFonts w:ascii="Times New Roman" w:hAnsi="Times New Roman"/>
-          <w:sz w:val="24"/>
-        </w:rPr>
-        <w:t xml:space="preserve">remains constrained — the CAK operates with limited resources relative to the complexity of the markets it regulates, particularly in the digital economy. Second,</w:t>
-      </w:r>
-      <w:r>
-        <w:rPr>
-          <w:rFonts w:ascii="Times New Roman" w:hAnsi="Times New Roman"/>
-          <w:sz w:val="24"/>
-        </w:rPr>
-        <w:t xml:space="preserve"> </w:t>
-      </w:r>
+        <w:t xml:space="preserve">Weakness 2 — Insufficient penalties</w:t>
+      </w:r>
+      <w:r>
+        <w:rPr>
+          <w:rFonts w:ascii="Times New Roman" w:hAnsi="Times New Roman"/>
+          <w:sz w:val="24"/>
+        </w:rPr>
+        <w:t xml:space="preserve">: Fines under the Competition Act are modest relative to the profits dominant firms earn from anti-competitive conduct. When the expected penalty is lower than the expected gain, rational firms will continue the behavior.</w:t>
+      </w:r>
+    </w:p>
+    <w:p>
+      <w:pPr>
+        <w:pStyle w:val="BodyText"/>
+        <w:spacing w:line="480" w:lineRule="exact" w:after="0"/>
+      </w:pPr>
       <w:r>
         <w:rPr>
           <w:rFonts w:ascii="Times New Roman" w:hAnsi="Times New Roman"/>
@@ -486,27 +536,14 @@
           <w:bCs/>
           <w:sz w:val="24"/>
         </w:rPr>
-        <w:t xml:space="preserve">penalties are insufficiently deterrent</w:t>
-      </w:r>
-      <w:r>
-        <w:rPr>
-          <w:rFonts w:ascii="Times New Roman" w:hAnsi="Times New Roman"/>
-          <w:sz w:val="24"/>
-        </w:rPr>
-        <w:t xml:space="preserve">: fines under the Competition Act are modest relative to the profits dominant firms earn from anti-competitive conduct, reducing the incentive for compliance.</w:t>
-      </w:r>
-    </w:p>
-    <w:p>
-      <w:pPr>
-        <w:pStyle w:val="BodyText"/>
-        <w:spacing w:line="480" w:lineRule="exact" w:after="0"/>
-      </w:pPr>
-      <w:r>
-        <w:rPr>
-          <w:rFonts w:ascii="Times New Roman" w:hAnsi="Times New Roman"/>
-          <w:sz w:val="24"/>
-        </w:rPr>
-        <w:t xml:space="preserve">Greenlaw et al. (2022) note that the effectiveness of competition law depends critically on enforcement mechanisms and available resources (Chapter 9). Kenya’s experience confirms this: the legal framework is sound, but institutional capacity and penalty structures need strengthening to protect consumers and maintain a level playing field.</w:t>
+        <w:t xml:space="preserve">Weakness 3 — Digital economy gaps</w:t>
+      </w:r>
+      <w:r>
+        <w:rPr>
+          <w:rFonts w:ascii="Times New Roman" w:hAnsi="Times New Roman"/>
+          <w:sz w:val="24"/>
+        </w:rPr>
+        <w:t xml:space="preserve">: Eshbayev et al. (2022) identify data accumulation as a new form of barrier to entry in digital markets — dominant platforms accumulate datasets that create competitive advantages new entrants cannot replicate (p. 18). Kenya’s Competition Act lacks specific provisions addressing data-driven market power, algorithmic pricing coordination, or platform self-preferencing, requiring legislative modernization.</w:t>
       </w:r>
     </w:p>
     <w:p>
@@ -548,7 +585,7 @@
           <w:rFonts w:ascii="Times New Roman" w:hAnsi="Times New Roman"/>
           <w:sz w:val="24"/>
         </w:rPr>
-        <w:t xml:space="preserve">Kenya’s Competition Act of 2010 provides a robust legal foundation for maintaining competitive markets, and the CAK’s intervention in the mobile money sector demonstrates that the framework can produce meaningful outcomes when effectively enforced. However, the challenges of regulating dominant digital platforms — characterized by network externalities, data advantages, and rapid innovation — require continued evolution of both the legal framework and the institutional capacity of the CAK. Strengthening enforcement resources and penalty structures would significantly improve the effectiveness of Kenya’s competition law in protecting consumers and promoting fair market competition.</w:t>
+        <w:t xml:space="preserve">Kenya’s Competition Act of 2010 provides a sound legal foundation for maintaining competitive markets, and the CAK’s mobile money interoperability intervention demonstrates that the framework can produce meaningful structural outcomes. However, constrained enforcement capacity, insufficient penalties, and gaps in digital economy regulation limit its overall effectiveness. Strengthening institutional resources, increasing penalty ceilings, and updating the Act to address data-driven market power would significantly improve Kenya’s ability to protect consumers and maintain a level playing field.</w:t>
       </w:r>
     </w:p>
     <w:p>
@@ -614,6 +651,42 @@
           <w:sz w:val="24"/>
         </w:rPr>
         <w:t xml:space="preserve">. https://www.cak.go.ke</w:t>
+      </w:r>
+    </w:p>
+    <w:p>
+      <w:pPr>
+        <w:pStyle w:val="BodyText"/>
+        <w:spacing w:line="480" w:lineRule="exact" w:after="0"/>
+      </w:pPr>
+      <w:r>
+        <w:rPr>
+          <w:rFonts w:ascii="Times New Roman" w:hAnsi="Times New Roman"/>
+          <w:sz w:val="24"/>
+        </w:rPr>
+        <w:t xml:space="preserve">Eshbayev, O., Rakhimova, S., Mirzaliev, S., Mulladjanova, N., Alimxodjaeva, N., Akhmedova, D., &amp; Akbarova, B. (2022). A systematic mapping study of effective regulations and policies against digital monopolies.</w:t>
+      </w:r>
+      <w:r>
+        <w:rPr>
+          <w:rFonts w:ascii="Times New Roman" w:hAnsi="Times New Roman"/>
+          <w:sz w:val="24"/>
+        </w:rPr>
+        <w:t xml:space="preserve"> </w:t>
+      </w:r>
+      <w:r>
+        <w:rPr>
+          <w:rFonts w:ascii="Times New Roman" w:hAnsi="Times New Roman"/>
+          <w:i/>
+          <w:iCs/>
+          <w:sz w:val="24"/>
+        </w:rPr>
+        <w:t xml:space="preserve">ACM Digital Library</w:t>
+      </w:r>
+      <w:r>
+        <w:rPr>
+          <w:rFonts w:ascii="Times New Roman" w:hAnsi="Times New Roman"/>
+          <w:sz w:val="24"/>
+        </w:rPr>
+        <w:t xml:space="preserve">, 16–22. https://doi.org/10.1145/3584202.3584205</w:t>
       </w:r>
     </w:p>
     <w:p>

</xml_diff>

<commit_message>
ECON1580 Unit 2: Final assignment — 995 words, consistent APA section citations, flowing prose Q3, all 5 sources properly cited
</commit_message>
<xml_diff>
--- a/ECON1580_Applied_Economics/Unit2_Regulatory_Policies/Assignment/Unit2_Assignment_Activity.docx
+++ b/ECON1580_Applied_Economics/Unit2_Regulatory_Policies/Assignment/Unit2_Assignment_Activity.docx
@@ -122,7 +122,7 @@
           <w:rFonts w:ascii="Times New Roman" w:hAnsi="Times New Roman"/>
           <w:sz w:val="24"/>
         </w:rPr>
-        <w:t xml:space="preserve">Kenya’s economy has grown rapidly over the past two decades, driven by expansion in telecommunications, financial services, and digital commerce. This growth has created risks of market concentration, where dominant firms can leverage their position to suppress competition and harm consumers. Kenya’s competition law framework, anchored by the Competition Act of 2010 and administered by the Competition Authority of Kenya (CAK), provides the institutional foundation for addressing these challenges. This paper examines Kenya’s key regulatory policy, a significant antitrust case, and an assessment of the effectiveness of Kenya’s competition laws.</w:t>
+        <w:t xml:space="preserve">Kenya’s economy has grown rapidly over the past two decades, driven by expansion in telecommunications, financial services, and digital commerce, creating real risks of market concentration where dominant firms can suppress competition and harm consumers. Kenya’s competition law framework, anchored by the Competition Act of 2010 and administered by the Competition Authority of Kenya (CAK), provides the institutional foundation for addressing these challenges. This paper examines Kenya’s key regulatory policy, a significant antitrust case, and an assessment of how effectively the country’s competition laws protect consumers and businesses.</w:t>
       </w:r>
     </w:p>
     <w:p>
@@ -164,30 +164,7 @@
           <w:rFonts w:ascii="Times New Roman" w:hAnsi="Times New Roman"/>
           <w:sz w:val="24"/>
         </w:rPr>
-        <w:t xml:space="preserve">Kenya’s primary regulatory instrument for maintaining competitive markets is the</w:t>
-      </w:r>
-      <w:r>
-        <w:rPr>
-          <w:rFonts w:ascii="Times New Roman" w:hAnsi="Times New Roman"/>
-          <w:sz w:val="24"/>
-        </w:rPr>
-        <w:t xml:space="preserve"> </w:t>
-      </w:r>
-      <w:r>
-        <w:rPr>
-          <w:rFonts w:ascii="Times New Roman" w:hAnsi="Times New Roman"/>
-          <w:b/>
-          <w:bCs/>
-          <w:sz w:val="24"/>
-        </w:rPr>
-        <w:t xml:space="preserve">Competition Act No. 12 of 2010</w:t>
-      </w:r>
-      <w:r>
-        <w:rPr>
-          <w:rFonts w:ascii="Times New Roman" w:hAnsi="Times New Roman"/>
-          <w:sz w:val="24"/>
-        </w:rPr>
-        <w:t xml:space="preserve">, which established the CAK as the independent body responsible for enforcing competition law. The Act prohibits restrictive trade practices, abuse of dominant market position, and mergers that substantially lessen competition (Competition Authority of Kenya, 2023).</w:t>
+        <w:t xml:space="preserve">Kenya’s primary regulatory instrument for maintaining competitive markets is the Competition Act No. 12 of 2010, which established the CAK as the independent body responsible for enforcing competition law. The Act prohibits restrictive trade practices, abuse of dominant market position, and mergers that substantially lessen competition (Competition Authority of Kenya, 2023).</w:t>
       </w:r>
     </w:p>
     <w:p>
@@ -200,37 +177,7 @@
           <w:rFonts w:ascii="Times New Roman" w:hAnsi="Times New Roman"/>
           <w:sz w:val="24"/>
         </w:rPr>
-        <w:t xml:space="preserve">The Act promotes</w:t>
-      </w:r>
-      <w:r>
-        <w:rPr>
-          <w:rFonts w:ascii="Times New Roman" w:hAnsi="Times New Roman"/>
-          <w:sz w:val="24"/>
-        </w:rPr>
-        <w:t xml:space="preserve"> </w:t>
-      </w:r>
-      <w:r>
-        <w:rPr>
-          <w:rFonts w:ascii="Times New Roman" w:hAnsi="Times New Roman"/>
-          <w:b/>
-          <w:bCs/>
-          <w:sz w:val="24"/>
-        </w:rPr>
-        <w:t xml:space="preserve">fairness</w:t>
-      </w:r>
-      <w:r>
-        <w:rPr>
-          <w:rFonts w:ascii="Times New Roman" w:hAnsi="Times New Roman"/>
-          <w:sz w:val="24"/>
-        </w:rPr>
-        <w:t xml:space="preserve"> </w:t>
-      </w:r>
-      <w:r>
-        <w:rPr>
-          <w:rFonts w:ascii="Times New Roman" w:hAnsi="Times New Roman"/>
-          <w:sz w:val="24"/>
-        </w:rPr>
-        <w:t xml:space="preserve">through its prohibition on abuse of dominance — preventing firms with significant market power from engaging in exclusionary conduct such as predatory pricing or tying arrangements. A firm is considered dominant when it holds a market share that enables it to act independently of competitive pressures. This provision directly addresses the concern that Greenlaw et al. (2022) identify in Chapter 9: monopoly power allows firms to set prices above the competitive level, creating deadweight loss and reducing consumer welfare.</w:t>
+        <w:t xml:space="preserve">The Act promotes fairness through its prohibition on abuse of dominance, which prevents firms with significant market power from engaging in exclusionary conduct such as predatory pricing or tying arrangements. A firm is considered dominant when it holds a market share that enables it to act independently of competitive pressures. This provision directly addresses the concern that Greenlaw et al. (2022) identify: when a single firm controls a market, it can set prices above the competitive level, creating deadweight loss and reducing consumer welfare (Section 9.2).</w:t>
       </w:r>
     </w:p>
     <w:p>
@@ -243,30 +190,7 @@
           <w:rFonts w:ascii="Times New Roman" w:hAnsi="Times New Roman"/>
           <w:sz w:val="24"/>
         </w:rPr>
-        <w:t xml:space="preserve">For</w:t>
-      </w:r>
-      <w:r>
-        <w:rPr>
-          <w:rFonts w:ascii="Times New Roman" w:hAnsi="Times New Roman"/>
-          <w:sz w:val="24"/>
-        </w:rPr>
-        <w:t xml:space="preserve"> </w:t>
-      </w:r>
-      <w:r>
-        <w:rPr>
-          <w:rFonts w:ascii="Times New Roman" w:hAnsi="Times New Roman"/>
-          <w:b/>
-          <w:bCs/>
-          <w:sz w:val="24"/>
-        </w:rPr>
-        <w:t xml:space="preserve">consumer protection</w:t>
-      </w:r>
-      <w:r>
-        <w:rPr>
-          <w:rFonts w:ascii="Times New Roman" w:hAnsi="Times New Roman"/>
-          <w:sz w:val="24"/>
-        </w:rPr>
-        <w:t xml:space="preserve">, the Act empowers the CAK to investigate and sanction price-fixing agreements, bid-rigging, and market allocation schemes — practices through which firms in concentrated markets collude to replicate monopoly outcomes. The Act also requires pre-merger notification for transactions above specified thresholds, allowing the CAK to block or impose conditions on mergers before they harm competition. In 2019, the CAK blocked the proposed merger between Telkom Kenya and Airtel Kenya on grounds that it would substantially reduce competition in the mobile telecommunications market, directly protecting consumers from reduced choice and higher prices.</w:t>
+        <w:t xml:space="preserve">For consumer protection, the Act empowers the CAK to investigate and sanction price-fixing agreements, bid-rigging, and market allocation schemes. The Act also requires pre-merger notification for transactions above specified thresholds, allowing the CAK to block or impose conditions on mergers before they harm competition. In 2019, the CAK blocked the proposed merger between Telkom Kenya and Airtel Kenya on grounds that it would substantially reduce competition in the mobile telecommunications market, directly protecting consumers from reduced choice and higher prices (Competition Authority of Kenya, 2023).</w:t>
       </w:r>
     </w:p>
     <w:p>
@@ -279,30 +203,7 @@
           <w:rFonts w:ascii="Times New Roman" w:hAnsi="Times New Roman"/>
           <w:sz w:val="24"/>
         </w:rPr>
-        <w:t xml:space="preserve">For</w:t>
-      </w:r>
-      <w:r>
-        <w:rPr>
-          <w:rFonts w:ascii="Times New Roman" w:hAnsi="Times New Roman"/>
-          <w:sz w:val="24"/>
-        </w:rPr>
-        <w:t xml:space="preserve"> </w:t>
-      </w:r>
-      <w:r>
-        <w:rPr>
-          <w:rFonts w:ascii="Times New Roman" w:hAnsi="Times New Roman"/>
-          <w:b/>
-          <w:bCs/>
-          <w:sz w:val="24"/>
-        </w:rPr>
-        <w:t xml:space="preserve">economic efficiency</w:t>
-      </w:r>
-      <w:r>
-        <w:rPr>
-          <w:rFonts w:ascii="Times New Roman" w:hAnsi="Times New Roman"/>
-          <w:sz w:val="24"/>
-        </w:rPr>
-        <w:t xml:space="preserve">, the regulatory framework creates conditions under which markets can approach the allocative and productive efficiency benchmarks of perfect competition — where price equals marginal cost and production occurs at minimum average total cost (Greenlaw et al., 2022, Section 8.4). By preventing dominant firms from erecting artificial barriers to entry, the Act enables new competitors to enter markets, driving down prices and improving quality.</w:t>
+        <w:t xml:space="preserve">For economic efficiency, the regulatory framework creates conditions under which markets can approach the allocative and productive efficiency benchmarks of perfect competition, where price equals marginal cost and production occurs at minimum average total cost (Greenlaw et al., 2022, Section 8.4). By preventing dominant firms from erecting artificial barriers to entry, the Act enables new competitors to enter markets, driving down prices and improving quality.</w:t>
       </w:r>
     </w:p>
     <w:p>
@@ -344,37 +245,7 @@
           <w:rFonts w:ascii="Times New Roman" w:hAnsi="Times New Roman"/>
           <w:sz w:val="24"/>
         </w:rPr>
-        <w:t xml:space="preserve">The most significant antitrust case in Kenya’s recent history involves</w:t>
-      </w:r>
-      <w:r>
-        <w:rPr>
-          <w:rFonts w:ascii="Times New Roman" w:hAnsi="Times New Roman"/>
-          <w:sz w:val="24"/>
-        </w:rPr>
-        <w:t xml:space="preserve"> </w:t>
-      </w:r>
-      <w:r>
-        <w:rPr>
-          <w:rFonts w:ascii="Times New Roman" w:hAnsi="Times New Roman"/>
-          <w:b/>
-          <w:bCs/>
-          <w:sz w:val="24"/>
-        </w:rPr>
-        <w:t xml:space="preserve">Safaricom Limited</w:t>
-      </w:r>
-      <w:r>
-        <w:rPr>
-          <w:rFonts w:ascii="Times New Roman" w:hAnsi="Times New Roman"/>
-          <w:sz w:val="24"/>
-        </w:rPr>
-        <w:t xml:space="preserve"> </w:t>
-      </w:r>
-      <w:r>
-        <w:rPr>
-          <w:rFonts w:ascii="Times New Roman" w:hAnsi="Times New Roman"/>
-          <w:sz w:val="24"/>
-        </w:rPr>
-        <w:t xml:space="preserve">and its dominance in the mobile money and telecommunications markets. Safaricom operates M-Pesa, Kenya’s dominant mobile money platform, which processes over 60% of Kenya’s GDP in transaction value annually and serves more than 30 million active users (Competition Authority of Kenya, 2023). Safaricom simultaneously holds approximately 65% of the mobile subscriber market, giving it an unparalleled combination of telecommunications and financial services dominance.</w:t>
+        <w:t xml:space="preserve">The most significant antitrust case in Kenya’s recent history involves Safaricom Limited and its dominance in the mobile money and telecommunications markets. Safaricom operates M-Pesa, Kenya’s dominant mobile money platform, which processes over 60% of Kenya’s GDP in transaction value annually and serves more than 30 million active users (Competition Authority of Kenya, 2023). Safaricom simultaneously holds approximately 65% of the mobile subscriber market, giving it an unparalleled combination of telecommunications and financial services dominance.</w:t>
       </w:r>
     </w:p>
     <w:p>
@@ -387,7 +258,7 @@
           <w:rFonts w:ascii="Times New Roman" w:hAnsi="Times New Roman"/>
           <w:sz w:val="24"/>
         </w:rPr>
-        <w:t xml:space="preserve">In 2018, the CAK conducted a formal market inquiry into the mobile money sector and found that Safaricom’s bundling of M-Pesa with its telecommunications services created significant structural barriers to entry for competing providers. Competitors such as Airtel Money and T-Kash faced a fundamental disadvantage: because most potential transaction counterparties were Safaricom subscribers, a mobile money service that could not transact with Safaricom users was commercially unviable. This is a textbook example of the network externality barrier that Tirole (2024) identifies as the primary mechanism through which digital platforms entrench dominance (p. i984).</w:t>
+        <w:t xml:space="preserve">In 2018, the CAK conducted a formal market inquiry into the mobile money sector and found that Safaricom’s bundling of M-Pesa with its telecommunications services created significant structural barriers to entry for competing providers. Competitors such as Airtel Money and T-Kash faced a fundamental disadvantage: because most potential transaction counterparties were Safaricom subscribers, a mobile money service that could not transact with Safaricom users was commercially unviable. This is precisely the network externality barrier that Tirole (2024) identifies as the primary mechanism through which digital platforms entrench dominance (p. i984).</w:t>
       </w:r>
     </w:p>
     <w:p>
@@ -400,7 +271,7 @@
           <w:rFonts w:ascii="Times New Roman" w:hAnsi="Times New Roman"/>
           <w:sz w:val="24"/>
         </w:rPr>
-        <w:t xml:space="preserve">The CAK’s remedy was mandatory mobile money interoperability — requiring all licensed mobile money providers to allow cross-network transactions. This intervention directly addressed the structural source of Safaricom’s competitive advantage rather than simply imposing a fine. The outcome was measurable: interoperability reduced transaction costs for consumers, expanded financial access for populations previously excluded from formal financial services, and created viable competitive conditions for Airtel Money and T-Kash to grow their user bases.</w:t>
+        <w:t xml:space="preserve">The CAK’s remedy was mandatory mobile money interoperability, requiring all licensed mobile money providers to allow cross-network transactions. This intervention addressed the structural source of Safaricom’s competitive advantage rather than simply imposing a fine. The outcome was measurable: interoperability reduced transaction costs for consumers, expanded financial access for previously excluded populations, and created viable competitive conditions for Airtel Money and T-Kash.</w:t>
       </w:r>
     </w:p>
     <w:p>
@@ -413,7 +284,7 @@
           <w:rFonts w:ascii="Times New Roman" w:hAnsi="Times New Roman"/>
           <w:sz w:val="24"/>
         </w:rPr>
-        <w:t xml:space="preserve">Spulber (2022) argues that effective antitrust enforcement in platform markets must move beyond traditional price-based analysis and address the structural features that entrench dominance — precisely what the CAK’s interoperability remedy achieved (p. 8). This case demonstrates that Kenya’s competition law framework is capable of sophisticated, structurally-targeted intervention in digital markets.</w:t>
+        <w:t xml:space="preserve">Spulber (2022) argues that effective antitrust enforcement in platform markets must move beyond traditional price-based analysis and address the structural features that entrench dominance (p. 8). The CAK’s interoperability remedy did exactly that, demonstrating that Kenya’s competition law framework is capable of sophisticated, structurally-targeted intervention.</w:t>
       </w:r>
     </w:p>
     <w:p>
@@ -455,7 +326,7 @@
           <w:rFonts w:ascii="Times New Roman" w:hAnsi="Times New Roman"/>
           <w:sz w:val="24"/>
         </w:rPr>
-        <w:t xml:space="preserve">Kenya’s competition law framework has demonstrated meaningful effectiveness while exhibiting limitations that constrain its impact on consumers and businesses.</w:t>
+        <w:t xml:space="preserve">Kenya’s competition law framework has demonstrated meaningful effectiveness in several respects, while exhibiting limitations that constrain its impact on consumers and businesses.</w:t>
       </w:r>
     </w:p>
     <w:p>
@@ -466,18 +337,9 @@
       <w:r>
         <w:rPr>
           <w:rFonts w:ascii="Times New Roman" w:hAnsi="Times New Roman"/>
-          <w:b/>
-          <w:bCs/>
-          <w:sz w:val="24"/>
-        </w:rPr>
-        <w:t xml:space="preserve">Strengths for consumers and businesses</w:t>
-      </w:r>
-      <w:r>
-        <w:rPr>
-          <w:rFonts w:ascii="Times New Roman" w:hAnsi="Times New Roman"/>
-          <w:sz w:val="24"/>
-        </w:rPr>
-        <w:t xml:space="preserve">: The CAK has conducted market inquiries in telecommunications, financial services, and petroleum, producing structural remedies that improved competitive conditions. The mobile money interoperability intervention produced direct consumer benefits — lower transaction costs and expanded financial inclusion. The blocked Telkom-Airtel merger protected consumers from further market concentration. For businesses, the merger notification regime provides legal certainty and prevents anti-competitive consolidation that would disadvantage smaller competitors.</w:t>
+          <w:sz w:val="24"/>
+        </w:rPr>
+        <w:t xml:space="preserve">On the positive side, the CAK has conducted market inquiries in telecommunications, financial services, and petroleum, producing structural remedies that improved competitive conditions. The mobile money interoperability intervention produced direct consumer benefits — lower transaction costs and expanded financial inclusion. The blocked Telkom-Airtel merger protected consumers from further market concentration. For businesses, the merger notification regime provides legal certainty and prevents anti-competitive consolidation that would disadvantage smaller competitors.</w:t>
       </w:r>
     </w:p>
     <w:p>
@@ -488,18 +350,9 @@
       <w:r>
         <w:rPr>
           <w:rFonts w:ascii="Times New Roman" w:hAnsi="Times New Roman"/>
-          <w:b/>
-          <w:bCs/>
-          <w:sz w:val="24"/>
-        </w:rPr>
-        <w:t xml:space="preserve">Weakness 1 — Enforcement capacity</w:t>
-      </w:r>
-      <w:r>
-        <w:rPr>
-          <w:rFonts w:ascii="Times New Roman" w:hAnsi="Times New Roman"/>
-          <w:sz w:val="24"/>
-        </w:rPr>
-        <w:t xml:space="preserve">: The CAK operates with limited resources relative to the complexity of the markets it regulates. Greenlaw et al. (2022) note that competition law effectiveness depends critically on enforcement mechanisms and available resources (Chapter 9). Kenya’s CAK has a significantly smaller budget and staff than comparable authorities in South Africa or the European Union, limiting proactive market investigation.</w:t>
+          <w:sz w:val="24"/>
+        </w:rPr>
+        <w:t xml:space="preserve">However, the framework faces three significant limitations. First, enforcement capacity remains constrained — the CAK operates with limited resources relative to the complexity of the markets it regulates, and Greenlaw et al. (2022) note that competition law effectiveness depends critically on enforcement mechanisms and available resources (Section 9.2). Kenya’s CAK has a significantly smaller budget and staff than comparable authorities in South Africa or the European Union, limiting proactive market investigation.</w:t>
       </w:r>
     </w:p>
     <w:p>
@@ -510,18 +363,9 @@
       <w:r>
         <w:rPr>
           <w:rFonts w:ascii="Times New Roman" w:hAnsi="Times New Roman"/>
-          <w:b/>
-          <w:bCs/>
-          <w:sz w:val="24"/>
-        </w:rPr>
-        <w:t xml:space="preserve">Weakness 2 — Insufficient penalties</w:t>
-      </w:r>
-      <w:r>
-        <w:rPr>
-          <w:rFonts w:ascii="Times New Roman" w:hAnsi="Times New Roman"/>
-          <w:sz w:val="24"/>
-        </w:rPr>
-        <w:t xml:space="preserve">: Fines under the Competition Act are modest relative to the profits dominant firms earn from anti-competitive conduct. When the expected penalty is lower than the expected gain, rational firms will continue the behavior.</w:t>
+          <w:sz w:val="24"/>
+        </w:rPr>
+        <w:t xml:space="preserve">Second, penalties under the Competition Act are modest relative to the profits dominant firms earn from anti-competitive conduct, reducing the deterrent effect.</w:t>
       </w:r>
     </w:p>
     <w:p>
@@ -532,18 +376,9 @@
       <w:r>
         <w:rPr>
           <w:rFonts w:ascii="Times New Roman" w:hAnsi="Times New Roman"/>
-          <w:b/>
-          <w:bCs/>
-          <w:sz w:val="24"/>
-        </w:rPr>
-        <w:t xml:space="preserve">Weakness 3 — Digital economy gaps</w:t>
-      </w:r>
-      <w:r>
-        <w:rPr>
-          <w:rFonts w:ascii="Times New Roman" w:hAnsi="Times New Roman"/>
-          <w:sz w:val="24"/>
-        </w:rPr>
-        <w:t xml:space="preserve">: Eshbayev et al. (2022) identify data accumulation as a new form of barrier to entry in digital markets — dominant platforms accumulate datasets that create competitive advantages new entrants cannot replicate (p. 18). Kenya’s Competition Act lacks specific provisions addressing data-driven market power, algorithmic pricing coordination, or platform self-preferencing, requiring legislative modernization.</w:t>
+          <w:sz w:val="24"/>
+        </w:rPr>
+        <w:t xml:space="preserve">Third, the Act contains significant gaps in addressing digital economy competition. Eshbayev et al. (2022) identify data accumulation as a new form of barrier to entry — dominant platforms accumulate datasets that create competitive advantages new entrants cannot replicate (p. 18). Kenya’s Competition Act lacks specific provisions addressing data-driven market power or platform self-preferencing, both of which are increasingly relevant as Kenya’s digital economy expands.</w:t>
       </w:r>
     </w:p>
     <w:p>

</xml_diff>